<commit_message>
Refine CV profile and highlight additional programming languages
</commit_message>
<xml_diff>
--- a/assets/cv/Nikita_Smiichyk_CV.docx
+++ b/assets/cv/Nikita_Smiichyk_CV.docx
@@ -183,7 +183,7 @@
           <w:rFonts w:eastAsia="Times New Roman"/>
           <w:lang w:eastAsia="en-GB"/>
         </w:rPr>
-        <w:t>Backend-focused Software Development student building REST APIs and database-backed systems with Java, Spring Boot, PostgreSQL, and SQL. Currently developing a platform with APIs for customers, products, prices, subscriptions, and payment intents, using PostgreSQL and Flyway for persistence and schema management. Interested in backend engineering, API design, and building reliable software systems.</w:t>
+        <w:t>Software Development student focused on backend engineering with Java, Spring Boot, and PostgreSQL. Practical experience building REST APIs and database-backed applications, with automated testing and Docker deployment.</w:t>
       </w:r>
     </w:p>
     <w:p>
@@ -278,37 +278,17 @@
         </w:tc>
       </w:tr>
       <w:tr>
-        <w:trPr>
-          <w:cnfStyle w:val="000000100000" w:firstRow="0" w:lastRow="0" w:firstColumn="0" w:lastColumn="0" w:oddVBand="0" w:evenVBand="0" w:oddHBand="1" w:evenHBand="0" w:firstRowFirstColumn="0" w:firstRowLastColumn="0" w:lastRowFirstColumn="0" w:lastRowLastColumn="0"/>
-        </w:trPr>
         <w:tc>
           <w:tcPr>
-            <w:cnfStyle w:val="001000000000" w:firstRow="0" w:lastRow="0" w:firstColumn="1" w:lastColumn="0" w:oddVBand="0" w:evenVBand="0" w:oddHBand="0" w:evenHBand="0" w:firstRowFirstColumn="0" w:firstRowLastColumn="0" w:lastRowFirstColumn="0" w:lastRowLastColumn="0"/>
             <w:tcW w:w="2835" w:type="dxa"/>
           </w:tcPr>
           <w:p>
-            <w:pPr>
-              <w:rPr>
-                <w:rFonts w:eastAsia="Times New Roman"/>
-                <w:b w:val="0"/>
-                <w:bCs w:val="0"/>
-                <w:lang w:eastAsia="en-GB"/>
-              </w:rPr>
-            </w:pPr>
-            <w:r>
-              <w:rPr>
-                <w:rStyle w:val="Strong"/>
+            <w:r>
+              <w:rPr>
                 <w:b/>
-                <w:bCs/>
-              </w:rPr>
-              <w:t>Backend:</w:t>
-            </w:r>
-            <w:r>
-              <w:rPr>
-                <w:b w:val="0"/>
-                <w:bCs w:val="0"/>
-              </w:rPr>
-              <w:t xml:space="preserve"> </w:t>
+                <w:lang w:val="en-GB"/>
+              </w:rPr>
+              <w:t>Additional Languages:</w:t>
             </w:r>
           </w:p>
         </w:tc>
@@ -317,61 +297,12 @@
             <w:tcW w:w="6181" w:type="dxa"/>
           </w:tcPr>
           <w:p>
-            <w:pPr>
-              <w:cnfStyle w:val="000000100000" w:firstRow="0" w:lastRow="0" w:firstColumn="0" w:lastColumn="0" w:oddVBand="0" w:evenVBand="0" w:oddHBand="1" w:evenHBand="0" w:firstRowFirstColumn="0" w:firstRowLastColumn="0" w:lastRowFirstColumn="0" w:lastRowLastColumn="0"/>
-              <w:rPr>
-                <w:rFonts w:eastAsia="Times New Roman"/>
-                <w:b/>
-                <w:bCs/>
-                <w:lang w:eastAsia="en-GB"/>
-              </w:rPr>
-            </w:pPr>
-            <w:r>
-              <w:t>Spring Boot, REST APIs, Spring Data JPA, JDBC, Maven</w:t>
-            </w:r>
-          </w:p>
-        </w:tc>
-      </w:tr>
-      <w:tr>
-        <w:tc>
-          <w:tcPr>
-            <w:cnfStyle w:val="001000000000" w:firstRow="0" w:lastRow="0" w:firstColumn="1" w:lastColumn="0" w:oddVBand="0" w:evenVBand="0" w:oddHBand="0" w:evenHBand="0" w:firstRowFirstColumn="0" w:firstRowLastColumn="0" w:lastRowFirstColumn="0" w:lastRowLastColumn="0"/>
-            <w:tcW w:w="2835" w:type="dxa"/>
-          </w:tcPr>
-          <w:p>
-            <w:pPr>
-              <w:rPr>
-                <w:rFonts w:eastAsia="Times New Roman"/>
-                <w:lang w:val="ru-RU" w:eastAsia="en-GB"/>
-              </w:rPr>
-            </w:pPr>
-            <w:r>
-              <w:rPr>
-                <w:rFonts w:eastAsia="Times New Roman"/>
-                <w:lang w:eastAsia="en-GB"/>
-              </w:rPr>
-              <w:t>Databases:</w:t>
-            </w:r>
-          </w:p>
-        </w:tc>
-        <w:tc>
-          <w:tcPr>
-            <w:tcW w:w="6181" w:type="dxa"/>
-          </w:tcPr>
-          <w:p>
-            <w:pPr>
-              <w:cnfStyle w:val="000000000000" w:firstRow="0" w:lastRow="0" w:firstColumn="0" w:lastColumn="0" w:oddVBand="0" w:evenVBand="0" w:oddHBand="0" w:evenHBand="0" w:firstRowFirstColumn="0" w:firstRowLastColumn="0" w:lastRowFirstColumn="0" w:lastRowLastColumn="0"/>
-              <w:rPr>
-                <w:rFonts w:eastAsia="Times New Roman"/>
-                <w:lang w:eastAsia="en-GB"/>
-              </w:rPr>
-            </w:pPr>
-            <w:r>
-              <w:rPr>
-                <w:rFonts w:eastAsia="Times New Roman"/>
-                <w:lang w:eastAsia="en-GB"/>
-              </w:rPr>
-              <w:t>PostgreSQL, MySQL, Flyway</w:t>
+            <w:r>
+              <w:rPr>
+                <w:b w:val="0"/>
+                <w:lang w:val="en-GB"/>
+              </w:rPr>
+              <w:t>Python, Kotlin, C++</w:t>
             </w:r>
           </w:p>
         </w:tc>
@@ -389,15 +320,25 @@
             <w:pPr>
               <w:rPr>
                 <w:rFonts w:eastAsia="Times New Roman"/>
+                <w:b w:val="0"/>
+                <w:bCs w:val="0"/>
                 <w:lang w:eastAsia="en-GB"/>
               </w:rPr>
             </w:pPr>
             <w:r>
               <w:rPr>
-                <w:rFonts w:eastAsia="Times New Roman"/>
-                <w:lang w:eastAsia="en-GB"/>
-              </w:rPr>
-              <w:t>Testing:</w:t>
+                <w:rStyle w:val="Strong"/>
+                <w:b/>
+                <w:bCs/>
+              </w:rPr>
+              <w:t>Backend:</w:t>
+            </w:r>
+            <w:r>
+              <w:rPr>
+                <w:b w:val="0"/>
+                <w:bCs w:val="0"/>
+              </w:rPr>
+              <w:t xml:space="preserve"> </w:t>
             </w:r>
           </w:p>
         </w:tc>
@@ -410,15 +351,13 @@
               <w:cnfStyle w:val="000000100000" w:firstRow="0" w:lastRow="0" w:firstColumn="0" w:lastColumn="0" w:oddVBand="0" w:evenVBand="0" w:oddHBand="1" w:evenHBand="0" w:firstRowFirstColumn="0" w:firstRowLastColumn="0" w:lastRowFirstColumn="0" w:lastRowLastColumn="0"/>
               <w:rPr>
                 <w:rFonts w:eastAsia="Times New Roman"/>
+                <w:b/>
+                <w:bCs/>
                 <w:lang w:eastAsia="en-GB"/>
               </w:rPr>
             </w:pPr>
             <w:r>
-              <w:rPr>
-                <w:rFonts w:eastAsia="Times New Roman"/>
-                <w:lang w:eastAsia="en-GB"/>
-              </w:rPr>
-              <w:t>JUnit</w:t>
+              <w:t>Spring Boot, REST APIs, Spring Data JPA, JDBC, Maven</w:t>
             </w:r>
           </w:p>
         </w:tc>
@@ -441,14 +380,7 @@
                 <w:rFonts w:eastAsia="Times New Roman"/>
                 <w:lang w:eastAsia="en-GB"/>
               </w:rPr>
-              <w:t>DevOps / Tools</w:t>
-            </w:r>
-            <w:r>
-              <w:rPr>
-                <w:rFonts w:eastAsia="Times New Roman"/>
-                <w:lang w:eastAsia="en-GB"/>
-              </w:rPr>
-              <w:t>:</w:t>
+              <w:t>Databases:</w:t>
             </w:r>
           </w:p>
         </w:tc>
@@ -469,7 +401,7 @@
                 <w:rFonts w:eastAsia="Times New Roman"/>
                 <w:lang w:eastAsia="en-GB"/>
               </w:rPr>
-              <w:t>Docker, Git, GitHub, Render, Neon PostgreSQL</w:t>
+              <w:t>PostgreSQL, MySQL, Flyway</w:t>
             </w:r>
           </w:p>
         </w:tc>
@@ -487,7 +419,7 @@
             <w:pPr>
               <w:rPr>
                 <w:rFonts w:eastAsia="Times New Roman"/>
-                <w:lang w:val="ru-RU" w:eastAsia="en-GB"/>
+                <w:lang w:eastAsia="en-GB"/>
               </w:rPr>
             </w:pPr>
             <w:r>
@@ -495,7 +427,7 @@
                 <w:rFonts w:eastAsia="Times New Roman"/>
                 <w:lang w:eastAsia="en-GB"/>
               </w:rPr>
-              <w:t>Frontend:</w:t>
+              <w:t>Testing:</w:t>
             </w:r>
           </w:p>
         </w:tc>
@@ -516,7 +448,7 @@
                 <w:rFonts w:eastAsia="Times New Roman"/>
                 <w:lang w:eastAsia="en-GB"/>
               </w:rPr>
-              <w:t>HTML, CSS, React, Bootstrap</w:t>
+              <w:t>JUnit 5</w:t>
             </w:r>
           </w:p>
         </w:tc>
@@ -539,7 +471,14 @@
                 <w:rFonts w:eastAsia="Times New Roman"/>
                 <w:lang w:eastAsia="en-GB"/>
               </w:rPr>
-              <w:t>Familiar With:</w:t>
+              <w:t>DevOps / Tools</w:t>
+            </w:r>
+            <w:r>
+              <w:rPr>
+                <w:rFonts w:eastAsia="Times New Roman"/>
+                <w:lang w:eastAsia="en-GB"/>
+              </w:rPr>
+              <w:t>:</w:t>
             </w:r>
           </w:p>
         </w:tc>
@@ -560,7 +499,98 @@
                 <w:rFonts w:eastAsia="Times New Roman"/>
                 <w:lang w:eastAsia="en-GB"/>
               </w:rPr>
-              <w:t>Python, PHP, Laravel, Node.js, MongoDB, C++, Kotlin</w:t>
+              <w:t>Docker, Git, GitHub, Render, Neon PostgreSQL</w:t>
+            </w:r>
+          </w:p>
+        </w:tc>
+      </w:tr>
+      <w:tr>
+        <w:trPr>
+          <w:cnfStyle w:val="000000100000" w:firstRow="0" w:lastRow="0" w:firstColumn="0" w:lastColumn="0" w:oddVBand="0" w:evenVBand="0" w:oddHBand="1" w:evenHBand="0" w:firstRowFirstColumn="0" w:firstRowLastColumn="0" w:lastRowFirstColumn="0" w:lastRowLastColumn="0"/>
+        </w:trPr>
+        <w:tc>
+          <w:tcPr>
+            <w:cnfStyle w:val="001000000000" w:firstRow="0" w:lastRow="0" w:firstColumn="1" w:lastColumn="0" w:oddVBand="0" w:evenVBand="0" w:oddHBand="0" w:evenHBand="0" w:firstRowFirstColumn="0" w:firstRowLastColumn="0" w:lastRowFirstColumn="0" w:lastRowLastColumn="0"/>
+            <w:tcW w:w="2835" w:type="dxa"/>
+          </w:tcPr>
+          <w:p>
+            <w:pPr>
+              <w:rPr>
+                <w:rFonts w:eastAsia="Times New Roman"/>
+                <w:lang w:val="ru-RU" w:eastAsia="en-GB"/>
+              </w:rPr>
+            </w:pPr>
+            <w:r>
+              <w:rPr>
+                <w:rFonts w:eastAsia="Times New Roman"/>
+                <w:lang w:eastAsia="en-GB"/>
+              </w:rPr>
+              <w:t>Frontend:</w:t>
+            </w:r>
+          </w:p>
+        </w:tc>
+        <w:tc>
+          <w:tcPr>
+            <w:tcW w:w="6181" w:type="dxa"/>
+          </w:tcPr>
+          <w:p>
+            <w:pPr>
+              <w:cnfStyle w:val="000000100000" w:firstRow="0" w:lastRow="0" w:firstColumn="0" w:lastColumn="0" w:oddVBand="0" w:evenVBand="0" w:oddHBand="1" w:evenHBand="0" w:firstRowFirstColumn="0" w:firstRowLastColumn="0" w:lastRowFirstColumn="0" w:lastRowLastColumn="0"/>
+              <w:rPr>
+                <w:rFonts w:eastAsia="Times New Roman"/>
+                <w:lang w:eastAsia="en-GB"/>
+              </w:rPr>
+            </w:pPr>
+            <w:r>
+              <w:rPr>
+                <w:rFonts w:eastAsia="Times New Roman"/>
+                <w:lang w:eastAsia="en-GB"/>
+              </w:rPr>
+              <w:t>HTML, CSS, React, Bootstrap</w:t>
+            </w:r>
+          </w:p>
+        </w:tc>
+      </w:tr>
+      <w:tr>
+        <w:tc>
+          <w:tcPr>
+            <w:cnfStyle w:val="001000000000" w:firstRow="0" w:lastRow="0" w:firstColumn="1" w:lastColumn="0" w:oddVBand="0" w:evenVBand="0" w:oddHBand="0" w:evenHBand="0" w:firstRowFirstColumn="0" w:firstRowLastColumn="0" w:lastRowFirstColumn="0" w:lastRowLastColumn="0"/>
+            <w:tcW w:w="2835" w:type="dxa"/>
+          </w:tcPr>
+          <w:p>
+            <w:pPr>
+              <w:rPr>
+                <w:rFonts w:eastAsia="Times New Roman"/>
+                <w:lang w:val="ru-RU" w:eastAsia="en-GB"/>
+              </w:rPr>
+            </w:pPr>
+            <w:r>
+              <w:rPr>
+                <w:rFonts w:eastAsia="Times New Roman"/>
+                <w:lang w:eastAsia="en-GB"/>
+              </w:rPr>
+              <w:t>Familiar With:</w:t>
+            </w:r>
+          </w:p>
+        </w:tc>
+        <w:tc>
+          <w:tcPr>
+            <w:tcW w:w="6181" w:type="dxa"/>
+          </w:tcPr>
+          <w:p>
+            <w:pPr>
+              <w:cnfStyle w:val="000000000000" w:firstRow="0" w:lastRow="0" w:firstColumn="0" w:lastColumn="0" w:oddVBand="0" w:evenVBand="0" w:oddHBand="0" w:evenHBand="0" w:firstRowFirstColumn="0" w:firstRowLastColumn="0" w:lastRowFirstColumn="0" w:lastRowLastColumn="0"/>
+              <w:rPr>
+                <w:rFonts w:eastAsia="Times New Roman"/>
+                <w:lang w:eastAsia="en-GB"/>
+              </w:rPr>
+            </w:pPr>
+            <w:r>
+              <w:rPr>
+                <w:rFonts w:eastAsia="Times New Roman"/>
+                <w:lang w:eastAsia="en-GB"/>
+              </w:rPr>
+              <w:t>PHP, Laravel, Node.js, MongoDB</w:t>
             </w:r>
           </w:p>
         </w:tc>

</xml_diff>